<commit_message>
Atualizações da Aula Inaugural
</commit_message>
<xml_diff>
--- a/TSOF/Aula_Inaugural/Introdução.docx
+++ b/TSOF/Aula_Inaugural/Introdução.docx
@@ -356,6 +356,58 @@
         </w:rPr>
         <w:t>o para a facilitação de processo ágeis e cultura do time.</w:t>
       </w:r>
+    </w:p>
+    <w:p>
+      <w:pPr>
+        <w:jc w:val="both"/>
+        <w:rPr>
+          <w:rFonts w:ascii="Times New Roman" w:hAnsi="Times New Roman" w:cs="Times New Roman"/>
+        </w:rPr>
+      </w:pPr>
+    </w:p>
+    <w:p>
+      <w:pPr>
+        <w:jc w:val="both"/>
+        <w:rPr>
+          <w:rFonts w:ascii="Times New Roman" w:hAnsi="Times New Roman" w:cs="Times New Roman"/>
+        </w:rPr>
+      </w:pPr>
+      <w:r>
+        <w:rPr>
+          <w:rFonts w:ascii="Times New Roman" w:hAnsi="Times New Roman" w:cs="Times New Roman"/>
+        </w:rPr>
+        <w:t xml:space="preserve">Teste de software é o processo de avaliar uma aplicação para identificar defeitos, verificar se os requisitos foram atendidos e fornecer evidências sobre a sua qualidade antes que </w:t>
+      </w:r>
+      <w:proofErr w:type="spellStart"/>
+      <w:r>
+        <w:rPr>
+          <w:rFonts w:ascii="Times New Roman" w:hAnsi="Times New Roman" w:cs="Times New Roman"/>
+        </w:rPr>
+        <w:t>el</w:t>
+      </w:r>
+      <w:proofErr w:type="spellEnd"/>
+      <w:r>
+        <w:rPr>
+          <w:rFonts w:ascii="Times New Roman" w:hAnsi="Times New Roman" w:cs="Times New Roman"/>
+        </w:rPr>
+        <w:t xml:space="preserve"> seja disponibilizada aos usuários.</w:t>
+      </w:r>
+    </w:p>
+    <w:p>
+      <w:pPr>
+        <w:jc w:val="both"/>
+        <w:rPr>
+          <w:rFonts w:ascii="Times New Roman" w:hAnsi="Times New Roman" w:cs="Times New Roman"/>
+        </w:rPr>
+      </w:pPr>
+    </w:p>
+    <w:p>
+      <w:pPr>
+        <w:jc w:val="both"/>
+        <w:rPr>
+          <w:rFonts w:ascii="Times New Roman" w:hAnsi="Times New Roman" w:cs="Times New Roman"/>
+        </w:rPr>
+      </w:pPr>
     </w:p>
     <w:p>
       <w:pPr>

</xml_diff>